<commit_message>
Update project report author names to Atik Bhas & Jay Sitapara across docx, md, and html reports
</commit_message>
<xml_diff>
--- a/Project_Report_Diabetes_Detection_System.docx
+++ b/Project_Report_Diabetes_Detection_System.docx
@@ -266,7 +266,7 @@
           <w:color w:val="2B579A"/>
           <w:sz w:val="28"/>
         </w:rPr>
-        <w:t>Tankariya Brijesh Jayeshbhai</w:t>
+        <w:t>Atik Bhas &amp; Jay Sitapara</w:t>
       </w:r>
     </w:p>
     <w:p>
@@ -349,7 +349,7 @@
           <w:b/>
           <w:sz w:val="28"/>
         </w:rPr>
-        <w:t>Tankariya Brijesh Jayeshbhai</w:t>
+        <w:t>Atik Bhas &amp; Jay Sitapara</w:t>
       </w:r>
     </w:p>
     <w:p>
@@ -893,7 +893,7 @@
         <w:t xml:space="preserve">➢ Developed By: </w:t>
       </w:r>
       <w:r>
-        <w:t>Tankariya Brijesh Jayeshbhai</w:t>
+        <w:t>Atik Bhas &amp; Jay Sitapara</w:t>
       </w:r>
     </w:p>
     <w:p>

</xml_diff>